<commit_message>
Update KPI logic and add KTXD project targets
</commit_message>
<xml_diff>
--- a/Kich_Ban_Thuyet_Trinh_DMT.docx
+++ b/Kich_Ban_Thuyet_Trinh_DMT.docx
@@ -248,7 +248,7 @@
     </w:p>
     <w:p>
       <w:r>
-        <w:t>Về cơ cấu điểm, hệ thống phân bổ 70% cho Công việc định kỳ và 30% cho Công việc giao ban.</w:t>
+        <w:t>Về cơ cấu điểm: Hệ thống không phân loại tỷ trọng cho công việc định kỳ hay phát sinh. TỔNG ĐIỂM = 100 điểm - ĐIỂM PHẠT + ĐIỂM THƯỞNG. Tất cả đầu mục công việc đều được chia đều tỷ trọng (nếu không có tỷ trọng tùy chỉnh).</w:t>
         <w:br/>
         <w:t>Ngoài ra, chúng ta có chính sách Thưởng/Phạt minh bạch trên hệ thống:</w:t>
         <w:br/>
@@ -280,7 +280,7 @@
         <w:br/>
         <w:t>- Loại A (Giỏi - trên 91 điểm): Nhận 100% lương KPI.</w:t>
         <w:br/>
-        <w:t>- Loại A* (Xuất sắc - trên 100 điểm): Đạt mức 105% lương KPI, nhằm khích lệ tinh thần làm việc vượt trội.</w:t>
+        <w:t>- Loại A* (Xuất sắc - trên 100 điểm): Đạt mức 110–120% lương, nhằm khích lệ tinh thần làm việc vượt trội.</w:t>
       </w:r>
     </w:p>
     <w:p>

</xml_diff>